<commit_message>
docs: Separar requerimientos globales de detallados
Así lo establecen las pautas del estudio inicial
</commit_message>
<xml_diff>
--- a/Documentación/doc - pdf/Estudio Inicial/Estudio Inicial - Proyecto Seminario Integrador - Gestión de alquileres.docx
+++ b/Documentación/doc - pdf/Estudio Inicial/Estudio Inicial - Proyecto Seminario Integrador - Gestión de alquileres.docx
@@ -1541,12 +1541,12 @@
             <wp:extent cx="1152525" cy="751840"/>
             <wp:effectExtent b="0" l="0" r="0" t="0"/>
             <wp:wrapNone/>
-            <wp:docPr descr="Resultado de imagen para logo utn" id="3" name="image3.png"/>
+            <wp:docPr descr="Resultado de imagen para logo utn" id="3" name="image4.png"/>
             <a:graphic>
               <a:graphicData uri="http://schemas.openxmlformats.org/drawingml/2006/picture">
                 <pic:pic>
                   <pic:nvPicPr>
-                    <pic:cNvPr descr="Resultado de imagen para logo utn" id="0" name="image3.png"/>
+                    <pic:cNvPr descr="Resultado de imagen para logo utn" id="0" name="image4.png"/>
                     <pic:cNvPicPr preferRelativeResize="0"/>
                   </pic:nvPicPr>
                   <pic:blipFill>
@@ -2548,7 +2548,7 @@
     </w:p>
     <w:sdt>
       <w:sdtPr>
-        <w:id w:val="-1738390735"/>
+        <w:id w:val="682825160"/>
         <w:docPartObj>
           <w:docPartGallery w:val="Table of Contents"/>
           <w:docPartUnique w:val="1"/>
@@ -3073,7 +3073,113 @@
                 <w:vertAlign w:val="baseline"/>
                 <w:rtl w:val="0"/>
               </w:rPr>
-              <w:t xml:space="preserve">6- Objetivo del SI</w:t>
+              <w:t xml:space="preserve">6- Propuesta del sistema de información</w:t>
+              <w:tab/>
+              <w:t xml:space="preserve">12</w:t>
+            </w:r>
+          </w:hyperlink>
+          <w:r>
+            <w:rPr>
+              <w:rtl w:val="0"/>
+            </w:rPr>
+          </w:r>
+        </w:p>
+        <w:p>
+          <w:pPr>
+            <w:widowControl w:val="0"/>
+            <w:tabs>
+              <w:tab w:val="right" w:leader="dot" w:pos="12000"/>
+            </w:tabs>
+            <w:spacing w:after="0" w:before="60" w:line="240" w:lineRule="auto"/>
+            <w:ind w:left="360" w:firstLine="0"/>
+            <w:rPr>
+              <w:rFonts w:ascii="Arial" w:cs="Arial" w:eastAsia="Arial" w:hAnsi="Arial"/>
+              <w:b w:val="1"/>
+              <w:bCs w:val="1"/>
+              <w:i w:val="0"/>
+              <w:iCs w:val="0"/>
+              <w:smallCaps w:val="0"/>
+              <w:strike w:val="0"/>
+              <w:color w:val="000000"/>
+              <w:sz w:val="22"/>
+              <w:szCs w:val="22"/>
+              <w:u w:val="none"/>
+              <w:shd w:fill="auto" w:val="clear"/>
+              <w:vertAlign w:val="baseline"/>
+            </w:rPr>
+          </w:pPr>
+          <w:hyperlink w:anchor="_s021gcn9s2zx">
+            <w:r>
+              <w:rPr>
+                <w:rFonts w:ascii="Arial" w:cs="Arial" w:eastAsia="Arial" w:hAnsi="Arial"/>
+                <w:b w:val="1"/>
+                <w:bCs w:val="1"/>
+                <w:i w:val="0"/>
+                <w:iCs w:val="0"/>
+                <w:smallCaps w:val="0"/>
+                <w:strike w:val="0"/>
+                <w:color w:val="000000"/>
+                <w:sz w:val="22"/>
+                <w:szCs w:val="22"/>
+                <w:u w:val="none"/>
+                <w:shd w:fill="auto" w:val="clear"/>
+                <w:vertAlign w:val="baseline"/>
+                <w:rtl w:val="0"/>
+              </w:rPr>
+              <w:t xml:space="preserve">6.1- Objetivo del SI</w:t>
+              <w:tab/>
+              <w:t xml:space="preserve">12</w:t>
+            </w:r>
+          </w:hyperlink>
+          <w:r>
+            <w:rPr>
+              <w:rtl w:val="0"/>
+            </w:rPr>
+          </w:r>
+        </w:p>
+        <w:p>
+          <w:pPr>
+            <w:widowControl w:val="0"/>
+            <w:tabs>
+              <w:tab w:val="right" w:leader="dot" w:pos="12000"/>
+            </w:tabs>
+            <w:spacing w:after="0" w:before="60" w:line="240" w:lineRule="auto"/>
+            <w:ind w:left="360" w:firstLine="0"/>
+            <w:rPr>
+              <w:rFonts w:ascii="Arial" w:cs="Arial" w:eastAsia="Arial" w:hAnsi="Arial"/>
+              <w:b w:val="1"/>
+              <w:bCs w:val="1"/>
+              <w:i w:val="0"/>
+              <w:iCs w:val="0"/>
+              <w:smallCaps w:val="0"/>
+              <w:strike w:val="0"/>
+              <w:color w:val="000000"/>
+              <w:sz w:val="22"/>
+              <w:szCs w:val="22"/>
+              <w:u w:val="none"/>
+              <w:shd w:fill="auto" w:val="clear"/>
+              <w:vertAlign w:val="baseline"/>
+            </w:rPr>
+          </w:pPr>
+          <w:hyperlink w:anchor="_kgissj6klkpu">
+            <w:r>
+              <w:rPr>
+                <w:rFonts w:ascii="Arial" w:cs="Arial" w:eastAsia="Arial" w:hAnsi="Arial"/>
+                <w:b w:val="1"/>
+                <w:bCs w:val="1"/>
+                <w:i w:val="0"/>
+                <w:iCs w:val="0"/>
+                <w:smallCaps w:val="0"/>
+                <w:strike w:val="0"/>
+                <w:color w:val="000000"/>
+                <w:sz w:val="22"/>
+                <w:szCs w:val="22"/>
+                <w:u w:val="none"/>
+                <w:shd w:fill="auto" w:val="clear"/>
+                <w:vertAlign w:val="baseline"/>
+                <w:rtl w:val="0"/>
+              </w:rPr>
+              <w:t xml:space="preserve">6.2- Requerimientos funcionales detallados</w:t>
               <w:tab/>
               <w:t xml:space="preserve">12</w:t>
             </w:r>
@@ -3284,7 +3390,49 @@
                 <w:vertAlign w:val="baseline"/>
                 <w:rtl w:val="0"/>
               </w:rPr>
-              <w:t xml:space="preserve">7.3- Prefactibilidad operativa</w:t>
+              <w:t xml:space="preserve">7.3- </w:t>
+            </w:r>
+          </w:hyperlink>
+          <w:hyperlink w:anchor="_ocdh7ukl7t49">
+            <w:r>
+              <w:rPr>
+                <w:rFonts w:ascii="Arial" w:cs="Arial" w:eastAsia="Arial" w:hAnsi="Arial"/>
+                <w:b w:val="1"/>
+                <w:bCs w:val="1"/>
+                <w:i w:val="0"/>
+                <w:iCs w:val="0"/>
+                <w:smallCaps w:val="0"/>
+                <w:strike w:val="0"/>
+                <w:color w:val="000000"/>
+                <w:sz w:val="22"/>
+                <w:szCs w:val="22"/>
+                <w:u w:val="none"/>
+                <w:shd w:fill="auto" w:val="clear"/>
+                <w:vertAlign w:val="baseline"/>
+                <w:rtl w:val="0"/>
+              </w:rPr>
+              <w:t xml:space="preserve">Prefactibilidad</w:t>
+            </w:r>
+          </w:hyperlink>
+          <w:hyperlink w:anchor="_ocdh7ukl7t49">
+            <w:r>
+              <w:rPr>
+                <w:rFonts w:ascii="Arial" w:cs="Arial" w:eastAsia="Arial" w:hAnsi="Arial"/>
+                <w:b w:val="1"/>
+                <w:bCs w:val="1"/>
+                <w:i w:val="0"/>
+                <w:iCs w:val="0"/>
+                <w:smallCaps w:val="0"/>
+                <w:strike w:val="0"/>
+                <w:color w:val="000000"/>
+                <w:sz w:val="22"/>
+                <w:szCs w:val="22"/>
+                <w:u w:val="none"/>
+                <w:shd w:fill="auto" w:val="clear"/>
+                <w:vertAlign w:val="baseline"/>
+                <w:rtl w:val="0"/>
+              </w:rPr>
+              <w:t xml:space="preserve"> operativa</w:t>
               <w:tab/>
               <w:t xml:space="preserve">13</w:t>
             </w:r>
@@ -4225,12 +4373,12 @@
           <wp:inline distB="114300" distT="114300" distL="114300" distR="114300">
             <wp:extent cx="5039865" cy="2501900"/>
             <wp:effectExtent b="0" l="0" r="0" t="0"/>
-            <wp:docPr id="5" name="image2.png"/>
+            <wp:docPr id="5" name="image7.png"/>
             <a:graphic>
               <a:graphicData uri="http://schemas.openxmlformats.org/drawingml/2006/picture">
                 <pic:pic>
                   <pic:nvPicPr>
-                    <pic:cNvPr id="0" name="image2.png"/>
+                    <pic:cNvPr id="0" name="image7.png"/>
                     <pic:cNvPicPr preferRelativeResize="0"/>
                   </pic:nvPicPr>
                   <pic:blipFill>
@@ -4852,17 +5000,46 @@
         <w:rPr>
           <w:b w:val="1"/>
           <w:bCs w:val="1"/>
-          <w:u w:val="single"/>
         </w:rPr>
       </w:pPr>
       <w:r>
         <w:rPr>
           <w:b w:val="1"/>
           <w:bCs w:val="1"/>
+          <w:rtl w:val="0"/>
+        </w:rPr>
+        <w:t xml:space="preserve">Requerimientos Funcionales Globales:</w:t>
+      </w:r>
+    </w:p>
+    <w:p>
+      <w:pPr>
+        <w:jc w:val="both"/>
+        <w:rPr/>
+      </w:pPr>
+      <w:r>
+        <w:rPr>
           <w:u w:val="single"/>
           <w:rtl w:val="0"/>
         </w:rPr>
-        <w:t xml:space="preserve">Requerimientos Funcionales:</w:t>
+        <w:t xml:space="preserve">Administrar</w:t>
+      </w:r>
+      <w:r>
+        <w:rPr>
+          <w:u w:val="single"/>
+          <w:rtl w:val="0"/>
+        </w:rPr>
+        <w:t xml:space="preserve"> propiedades en alquiler:</w:t>
+      </w:r>
+      <w:r>
+        <w:rPr>
+          <w:rtl w:val="0"/>
+        </w:rPr>
+        <w:t xml:space="preserve"> añadir o eliminar propiedades de un locador con detalles identificadores de las mismas y definir si las mismas se encuentran disponibles para alquilar o ya están alquiladas.</w:t>
+      </w:r>
+      <w:r>
+        <w:rPr>
+          <w:rtl w:val="0"/>
+        </w:rPr>
       </w:r>
     </w:p>
     <w:p>
@@ -4875,20 +5052,433 @@
           <w:u w:val="single"/>
           <w:rtl w:val="0"/>
         </w:rPr>
-        <w:t xml:space="preserve">Administrar</w:t>
-      </w:r>
+        <w:t xml:space="preserve">Gestionar alquileres:</w:t>
+      </w:r>
+      <w:r>
+        <w:rPr>
+          <w:rtl w:val="0"/>
+        </w:rPr>
+        <w:t xml:space="preserve"> asociar un contrato de alquiler a una propiedad y vincular un alquiler entre locador y locatario.</w:t>
+      </w:r>
+      <w:r>
+        <w:rPr>
+          <w:rtl w:val="0"/>
+        </w:rPr>
+      </w:r>
+    </w:p>
+    <w:p>
+      <w:pPr>
+        <w:jc w:val="both"/>
+        <w:rPr/>
+      </w:pPr>
       <w:r>
         <w:rPr>
           <w:u w:val="single"/>
           <w:rtl w:val="0"/>
         </w:rPr>
-        <w:t xml:space="preserve"> propiedades en alquiler:</w:t>
-      </w:r>
-      <w:r>
-        <w:rPr>
-          <w:rtl w:val="0"/>
-        </w:rPr>
-        <w:t xml:space="preserve"> añadir o eliminar propiedades de un locador con detalles identificadores de las mismas y definir si las mismas se encuentran disponibles para alquilar o ya están alquiladas.</w:t>
+        <w:t xml:space="preserve">Gestionar cobros:</w:t>
+      </w:r>
+      <w:r>
+        <w:rPr>
+          <w:rtl w:val="0"/>
+        </w:rPr>
+        <w:t xml:space="preserve"> calcular y procesar cobro a realizarse por propiedad mes a mes, ajustando automáticamente el monto pactado de acuerdo al índice declarado en el contrato y excluyendo el monto de expensas extraordinarias, asignando el mismo únicamente al locador.</w:t>
+      </w:r>
+      <w:r>
+        <w:rPr>
+          <w:rtl w:val="0"/>
+        </w:rPr>
+      </w:r>
+    </w:p>
+    <w:p>
+      <w:pPr>
+        <w:jc w:val="both"/>
+        <w:rPr/>
+      </w:pPr>
+      <w:r>
+        <w:rPr>
+          <w:u w:val="single"/>
+          <w:rtl w:val="0"/>
+        </w:rPr>
+        <w:t xml:space="preserve">Gestionar reclamos:</w:t>
+      </w:r>
+      <w:r>
+        <w:rPr>
+          <w:rtl w:val="0"/>
+        </w:rPr>
+        <w:t xml:space="preserve"> llevar un seguimiento de los reclamos o consultas que pueda realizar el locatario al locador con respecto a la propiedad que esté alquilando.</w:t>
+      </w:r>
+      <w:r>
+        <w:rPr>
+          <w:rtl w:val="0"/>
+        </w:rPr>
+      </w:r>
+    </w:p>
+    <w:p>
+      <w:pPr>
+        <w:jc w:val="both"/>
+        <w:rPr/>
+      </w:pPr>
+      <w:r>
+        <w:rPr>
+          <w:u w:val="single"/>
+          <w:rtl w:val="0"/>
+        </w:rPr>
+        <w:t xml:space="preserve">Administrar usuarios:</w:t>
+      </w:r>
+      <w:r>
+        <w:rPr>
+          <w:rtl w:val="0"/>
+        </w:rPr>
+        <w:t xml:space="preserve"> permitir el registro de usuarios en la plataforma.</w:t>
+      </w:r>
+      <w:r>
+        <w:rPr>
+          <w:rtl w:val="0"/>
+        </w:rPr>
+      </w:r>
+    </w:p>
+    <w:p>
+      <w:pPr>
+        <w:jc w:val="both"/>
+        <w:rPr/>
+      </w:pPr>
+      <w:r>
+        <w:rPr>
+          <w:u w:val="single"/>
+          <w:rtl w:val="0"/>
+        </w:rPr>
+        <w:t xml:space="preserve">Gestionar notificaciones:</w:t>
+      </w:r>
+      <w:r>
+        <w:rPr>
+          <w:rtl w:val="0"/>
+        </w:rPr>
+        <w:t xml:space="preserve"> realizar el envío de notificaciones a los locadores y locatarios, como recordatorios de pagos o para informar de un nuevo reclamo.</w:t>
+      </w:r>
+      <w:r>
+        <w:rPr>
+          <w:rtl w:val="0"/>
+        </w:rPr>
+      </w:r>
+    </w:p>
+    <w:p>
+      <w:pPr>
+        <w:jc w:val="both"/>
+        <w:rPr/>
+      </w:pPr>
+      <w:r>
+        <w:rPr>
+          <w:u w:val="single"/>
+          <w:rtl w:val="0"/>
+        </w:rPr>
+        <w:t xml:space="preserve">Gestionar mensajes:</w:t>
+      </w:r>
+      <w:r>
+        <w:rPr>
+          <w:rtl w:val="0"/>
+        </w:rPr>
+        <w:t xml:space="preserve"> permitir la comunicación dentro de la plataforma entre locador y locatario.</w:t>
+      </w:r>
+      <w:r>
+        <w:rPr>
+          <w:rtl w:val="0"/>
+        </w:rPr>
+      </w:r>
+    </w:p>
+    <w:p>
+      <w:pPr>
+        <w:jc w:val="both"/>
+        <w:rPr/>
+      </w:pPr>
+      <w:r>
+        <w:rPr>
+          <w:u w:val="single"/>
+          <w:rtl w:val="0"/>
+        </w:rPr>
+        <w:t xml:space="preserve">Gestionar reportes e informes:</w:t>
+      </w:r>
+      <w:r>
+        <w:rPr>
+          <w:rtl w:val="0"/>
+        </w:rPr>
+        <w:t xml:space="preserve"> recopilar los datos necesarios para la generación de reportes e informes.</w:t>
+      </w:r>
+      <w:r>
+        <w:rPr>
+          <w:rtl w:val="0"/>
+        </w:rPr>
+      </w:r>
+    </w:p>
+    <w:p>
+      <w:pPr>
+        <w:jc w:val="both"/>
+        <w:rPr/>
+      </w:pPr>
+      <w:r>
+        <w:rPr>
+          <w:rtl w:val="0"/>
+        </w:rPr>
+      </w:r>
+    </w:p>
+    <w:p>
+      <w:pPr>
+        <w:jc w:val="both"/>
+        <w:rPr>
+          <w:b w:val="1"/>
+          <w:bCs w:val="1"/>
+        </w:rPr>
+      </w:pPr>
+      <w:r>
+        <w:rPr>
+          <w:b w:val="1"/>
+          <w:bCs w:val="1"/>
+          <w:rtl w:val="0"/>
+        </w:rPr>
+        <w:t xml:space="preserve">Requerimientos No Funcionales:</w:t>
+      </w:r>
+    </w:p>
+    <w:p>
+      <w:pPr>
+        <w:numPr>
+          <w:ilvl w:val="0"/>
+          <w:numId w:val="2"/>
+        </w:numPr>
+        <w:spacing w:after="0" w:afterAutospacing="0"/>
+        <w:ind w:left="720" w:hanging="360"/>
+        <w:jc w:val="both"/>
+      </w:pPr>
+      <w:r>
+        <w:rPr>
+          <w:rtl w:val="0"/>
+        </w:rPr>
+        <w:t xml:space="preserve">El proyecto se debe desarrollar con tecnologías web y soportar los navegadores Google Chrome, Mozilla Firefox y Safari, tanto en sus versiones de escritorio como móviles.</w:t>
+      </w:r>
+    </w:p>
+    <w:p>
+      <w:pPr>
+        <w:numPr>
+          <w:ilvl w:val="0"/>
+          <w:numId w:val="2"/>
+        </w:numPr>
+        <w:spacing w:after="0" w:afterAutospacing="0"/>
+        <w:ind w:left="720" w:hanging="360"/>
+        <w:jc w:val="both"/>
+      </w:pPr>
+      <w:r>
+        <w:rPr>
+          <w:rtl w:val="0"/>
+        </w:rPr>
+        <w:t xml:space="preserve">El diseño debe ser </w:t>
+      </w:r>
+      <w:r>
+        <w:rPr>
+          <w:i w:val="1"/>
+          <w:iCs w:val="1"/>
+          <w:rtl w:val="0"/>
+        </w:rPr>
+        <w:t xml:space="preserve">responsive</w:t>
+      </w:r>
+      <w:r>
+        <w:rPr>
+          <w:rtl w:val="0"/>
+        </w:rPr>
+        <w:t xml:space="preserve">.</w:t>
+      </w:r>
+    </w:p>
+    <w:p>
+      <w:pPr>
+        <w:numPr>
+          <w:ilvl w:val="0"/>
+          <w:numId w:val="2"/>
+        </w:numPr>
+        <w:spacing w:after="0" w:afterAutospacing="0"/>
+        <w:ind w:left="720" w:hanging="360"/>
+        <w:jc w:val="both"/>
+      </w:pPr>
+      <w:r>
+        <w:rPr>
+          <w:rtl w:val="0"/>
+        </w:rPr>
+        <w:t xml:space="preserve">La gestión de contratos debe seguir los lineamientos de la ley vigente de contratos de alquileres.</w:t>
+      </w:r>
+    </w:p>
+    <w:p>
+      <w:pPr>
+        <w:numPr>
+          <w:ilvl w:val="0"/>
+          <w:numId w:val="2"/>
+        </w:numPr>
+        <w:spacing w:after="0" w:afterAutospacing="0"/>
+        <w:ind w:left="720" w:hanging="360"/>
+        <w:jc w:val="both"/>
+      </w:pPr>
+      <w:r>
+        <w:rPr>
+          <w:rtl w:val="0"/>
+        </w:rPr>
+        <w:t xml:space="preserve">La actualización de precios de alquileres debe seguir los índices IPC o ICL proporcionados por la página oficial del gobierno.</w:t>
+      </w:r>
+    </w:p>
+    <w:p>
+      <w:pPr>
+        <w:numPr>
+          <w:ilvl w:val="0"/>
+          <w:numId w:val="2"/>
+        </w:numPr>
+        <w:spacing w:after="0" w:afterAutospacing="0"/>
+        <w:ind w:left="720" w:hanging="360"/>
+        <w:jc w:val="both"/>
+      </w:pPr>
+      <w:r>
+        <w:rPr>
+          <w:rtl w:val="0"/>
+        </w:rPr>
+        <w:t xml:space="preserve">Se deberá utilizar la base de datos Supabase.</w:t>
+      </w:r>
+    </w:p>
+    <w:p>
+      <w:pPr>
+        <w:numPr>
+          <w:ilvl w:val="0"/>
+          <w:numId w:val="2"/>
+        </w:numPr>
+        <w:spacing w:after="0" w:afterAutospacing="0"/>
+        <w:ind w:left="720" w:hanging="360"/>
+        <w:jc w:val="both"/>
+      </w:pPr>
+      <w:r>
+        <w:rPr>
+          <w:rtl w:val="0"/>
+        </w:rPr>
+        <w:t xml:space="preserve">La gestión de cobros debe poder realizarse en efectivo o a través de la plataforma de MercadoPago.</w:t>
+      </w:r>
+    </w:p>
+    <w:p>
+      <w:pPr>
+        <w:numPr>
+          <w:ilvl w:val="0"/>
+          <w:numId w:val="2"/>
+        </w:numPr>
+        <w:spacing w:after="0" w:afterAutospacing="0"/>
+        <w:ind w:left="720" w:hanging="360"/>
+        <w:jc w:val="both"/>
+      </w:pPr>
+      <w:r>
+        <w:rPr>
+          <w:rtl w:val="0"/>
+        </w:rPr>
+        <w:t xml:space="preserve">Se debe poder enviar notificaciones a los usuarios vía mail y dentro de la misma página web. </w:t>
+      </w:r>
+    </w:p>
+    <w:p>
+      <w:pPr>
+        <w:numPr>
+          <w:ilvl w:val="0"/>
+          <w:numId w:val="2"/>
+        </w:numPr>
+        <w:ind w:left="720" w:hanging="360"/>
+        <w:jc w:val="both"/>
+      </w:pPr>
+      <w:r>
+        <w:rPr>
+          <w:rtl w:val="0"/>
+        </w:rPr>
+        <w:t xml:space="preserve">Se utilizará una integración con IA (Gemini) para realizar análisis de los contratos y resolver consultas.</w:t>
+      </w:r>
+      <w:r>
+        <w:rPr>
+          <w:rtl w:val="0"/>
+        </w:rPr>
+      </w:r>
+    </w:p>
+    <w:p>
+      <w:pPr>
+        <w:pStyle w:val="Heading1"/>
+        <w:ind w:hanging="566.9291338582675"/>
+        <w:jc w:val="both"/>
+        <w:rPr>
+          <w:rFonts w:ascii="Arial" w:cs="Arial" w:eastAsia="Arial" w:hAnsi="Arial"/>
+          <w:color w:val="1c4587"/>
+        </w:rPr>
+      </w:pPr>
+      <w:bookmarkStart w:colFirst="0" w:colLast="0" w:name="_jacemy3d30wp" w:id="11"/>
+      <w:bookmarkEnd w:id="11"/>
+      <w:r>
+        <w:rPr>
+          <w:rtl w:val="0"/>
+        </w:rPr>
+        <w:t xml:space="preserve">6</w:t>
+      </w:r>
+      <w:r>
+        <w:rPr>
+          <w:rFonts w:ascii="Arial" w:cs="Arial" w:eastAsia="Arial" w:hAnsi="Arial"/>
+          <w:color w:val="1c4587"/>
+          <w:rtl w:val="0"/>
+        </w:rPr>
+        <w:t xml:space="preserve">- Propuesta del sistema de información</w:t>
+      </w:r>
+    </w:p>
+    <w:p>
+      <w:pPr>
+        <w:pStyle w:val="Heading2"/>
+        <w:ind w:left="0" w:firstLine="0"/>
+        <w:rPr/>
+      </w:pPr>
+      <w:bookmarkStart w:colFirst="0" w:colLast="0" w:name="_s021gcn9s2zx" w:id="12"/>
+      <w:bookmarkEnd w:id="12"/>
+      <w:r>
+        <w:rPr>
+          <w:rtl w:val="0"/>
+        </w:rPr>
+        <w:t xml:space="preserve">6.1- Objetivo del SI</w:t>
+      </w:r>
+    </w:p>
+    <w:p>
+      <w:pPr>
+        <w:ind w:firstLine="425.19685039370086"/>
+        <w:jc w:val="both"/>
+        <w:rPr/>
+      </w:pPr>
+      <w:r>
+        <w:rPr>
+          <w:rtl w:val="0"/>
+        </w:rPr>
+        <w:t xml:space="preserve">El producto tiene como objetivo brindar información que permita centralizar el ofrecimiento, cierre de contrato y la gestión de alquileres realizados de manera directa entre locadores y locatarios. Busca simplificar la trazabilidad de los alquileres de inicio a fin, automatizar las actualizaciones periódicas del monto establecido en el contrato y la republicación de alquileres una vez vencido el plazo pactado, y agilizar el firmado de los contratos.</w:t>
+      </w:r>
+    </w:p>
+    <w:p>
+      <w:pPr>
+        <w:pStyle w:val="Heading2"/>
+        <w:ind w:left="0" w:firstLine="0"/>
+        <w:jc w:val="both"/>
+        <w:rPr/>
+      </w:pPr>
+      <w:bookmarkStart w:colFirst="0" w:colLast="0" w:name="_kgissj6klkpu" w:id="13"/>
+      <w:bookmarkEnd w:id="13"/>
+      <w:r>
+        <w:rPr>
+          <w:rtl w:val="0"/>
+        </w:rPr>
+        <w:t xml:space="preserve">6.2- Requerimientos funcionales detallados</w:t>
+      </w:r>
+    </w:p>
+    <w:p>
+      <w:pPr>
+        <w:jc w:val="both"/>
+        <w:rPr/>
+      </w:pPr>
+      <w:r>
+        <w:rPr>
+          <w:u w:val="single"/>
+          <w:rtl w:val="0"/>
+        </w:rPr>
+        <w:t xml:space="preserve">Administrar propiedades en alquiler:</w:t>
+      </w:r>
+      <w:r>
+        <w:rPr>
+          <w:rtl w:val="0"/>
+        </w:rPr>
       </w:r>
     </w:p>
     <w:p>
@@ -4900,6 +5490,14 @@
         <w:spacing w:after="0" w:afterAutospacing="0"/>
         <w:ind w:left="720" w:hanging="360"/>
         <w:jc w:val="both"/>
+        <w:rPr>
+          <w:rFonts w:ascii="Aptos" w:cs="Aptos" w:eastAsia="Aptos" w:hAnsi="Aptos"/>
+          <w:b w:val="0"/>
+          <w:bCs w:val="0"/>
+          <w:i w:val="0"/>
+          <w:iCs w:val="0"/>
+          <w:color w:val="000000"/>
+        </w:rPr>
       </w:pPr>
       <w:r>
         <w:rPr>
@@ -4917,6 +5515,14 @@
         <w:spacing w:after="0" w:afterAutospacing="0"/>
         <w:ind w:left="720" w:hanging="360"/>
         <w:jc w:val="both"/>
+        <w:rPr>
+          <w:rFonts w:ascii="Aptos" w:cs="Aptos" w:eastAsia="Aptos" w:hAnsi="Aptos"/>
+          <w:b w:val="0"/>
+          <w:bCs w:val="0"/>
+          <w:i w:val="0"/>
+          <w:iCs w:val="0"/>
+          <w:color w:val="000000"/>
+        </w:rPr>
       </w:pPr>
       <w:r>
         <w:rPr>
@@ -4934,6 +5540,14 @@
         <w:spacing w:after="0" w:afterAutospacing="0"/>
         <w:ind w:left="720" w:hanging="360"/>
         <w:jc w:val="both"/>
+        <w:rPr>
+          <w:rFonts w:ascii="Aptos" w:cs="Aptos" w:eastAsia="Aptos" w:hAnsi="Aptos"/>
+          <w:b w:val="0"/>
+          <w:bCs w:val="0"/>
+          <w:i w:val="0"/>
+          <w:iCs w:val="0"/>
+          <w:color w:val="000000"/>
+        </w:rPr>
       </w:pPr>
       <w:r>
         <w:rPr>
@@ -4950,6 +5564,14 @@
         </w:numPr>
         <w:ind w:left="720" w:hanging="360"/>
         <w:jc w:val="both"/>
+        <w:rPr>
+          <w:rFonts w:ascii="Aptos" w:cs="Aptos" w:eastAsia="Aptos" w:hAnsi="Aptos"/>
+          <w:b w:val="0"/>
+          <w:bCs w:val="0"/>
+          <w:i w:val="0"/>
+          <w:iCs w:val="0"/>
+          <w:color w:val="000000"/>
+        </w:rPr>
       </w:pPr>
       <w:r>
         <w:rPr>
@@ -4974,7 +5596,6 @@
         <w:rPr>
           <w:rtl w:val="0"/>
         </w:rPr>
-        <w:t xml:space="preserve"> asociar un contrato de alquiler a una propiedad y vincular un alquiler entre locador y locatario.</w:t>
       </w:r>
     </w:p>
     <w:p>
@@ -4986,6 +5607,14 @@
         <w:spacing w:after="0" w:afterAutospacing="0"/>
         <w:ind w:left="720" w:hanging="360"/>
         <w:jc w:val="both"/>
+        <w:rPr>
+          <w:rFonts w:ascii="Aptos" w:cs="Aptos" w:eastAsia="Aptos" w:hAnsi="Aptos"/>
+          <w:b w:val="0"/>
+          <w:bCs w:val="0"/>
+          <w:i w:val="0"/>
+          <w:iCs w:val="0"/>
+          <w:color w:val="000000"/>
+        </w:rPr>
       </w:pPr>
       <w:r>
         <w:rPr>
@@ -5002,6 +5631,14 @@
         </w:numPr>
         <w:ind w:left="720" w:hanging="360"/>
         <w:jc w:val="both"/>
+        <w:rPr>
+          <w:rFonts w:ascii="Aptos" w:cs="Aptos" w:eastAsia="Aptos" w:hAnsi="Aptos"/>
+          <w:b w:val="0"/>
+          <w:bCs w:val="0"/>
+          <w:i w:val="0"/>
+          <w:iCs w:val="0"/>
+          <w:color w:val="000000"/>
+        </w:rPr>
       </w:pPr>
       <w:r>
         <w:rPr>
@@ -5026,7 +5663,6 @@
         <w:rPr>
           <w:rtl w:val="0"/>
         </w:rPr>
-        <w:t xml:space="preserve"> calcular y procesar cobro a realizarse por propiedad mes a mes, ajustando automáticamente el monto pactado de acuerdo al índice declarado en el contrato y excluyendo el monto de expensas extraordinarias, asignando el mismo únicamente al locador.</w:t>
       </w:r>
     </w:p>
     <w:p>
@@ -5038,6 +5674,14 @@
         <w:spacing w:after="0" w:afterAutospacing="0"/>
         <w:ind w:left="720" w:hanging="360"/>
         <w:jc w:val="both"/>
+        <w:rPr>
+          <w:rFonts w:ascii="Aptos" w:cs="Aptos" w:eastAsia="Aptos" w:hAnsi="Aptos"/>
+          <w:b w:val="0"/>
+          <w:bCs w:val="0"/>
+          <w:i w:val="0"/>
+          <w:iCs w:val="0"/>
+          <w:color w:val="000000"/>
+        </w:rPr>
       </w:pPr>
       <w:r>
         <w:rPr>
@@ -5055,6 +5699,14 @@
         <w:spacing w:after="0" w:afterAutospacing="0"/>
         <w:ind w:left="720" w:hanging="360"/>
         <w:jc w:val="both"/>
+        <w:rPr>
+          <w:rFonts w:ascii="Aptos" w:cs="Aptos" w:eastAsia="Aptos" w:hAnsi="Aptos"/>
+          <w:b w:val="0"/>
+          <w:bCs w:val="0"/>
+          <w:i w:val="0"/>
+          <w:iCs w:val="0"/>
+          <w:color w:val="000000"/>
+        </w:rPr>
       </w:pPr>
       <w:r>
         <w:rPr>
@@ -5071,6 +5723,14 @@
         </w:numPr>
         <w:ind w:left="720" w:hanging="360"/>
         <w:jc w:val="both"/>
+        <w:rPr>
+          <w:rFonts w:ascii="Aptos" w:cs="Aptos" w:eastAsia="Aptos" w:hAnsi="Aptos"/>
+          <w:b w:val="0"/>
+          <w:bCs w:val="0"/>
+          <w:i w:val="0"/>
+          <w:iCs w:val="0"/>
+          <w:color w:val="000000"/>
+        </w:rPr>
       </w:pPr>
       <w:r>
         <w:rPr>
@@ -5095,7 +5755,6 @@
         <w:rPr>
           <w:rtl w:val="0"/>
         </w:rPr>
-        <w:t xml:space="preserve"> llevar un seguimiento de los reclamos o consultas que pueda realizar el locatario al locador con respecto a la propiedad que esté alquilando.</w:t>
       </w:r>
     </w:p>
     <w:p>
@@ -5107,6 +5766,14 @@
         <w:spacing w:after="0" w:afterAutospacing="0"/>
         <w:ind w:left="720" w:hanging="360"/>
         <w:jc w:val="both"/>
+        <w:rPr>
+          <w:rFonts w:ascii="Aptos" w:cs="Aptos" w:eastAsia="Aptos" w:hAnsi="Aptos"/>
+          <w:b w:val="0"/>
+          <w:bCs w:val="0"/>
+          <w:i w:val="0"/>
+          <w:iCs w:val="0"/>
+          <w:color w:val="000000"/>
+        </w:rPr>
       </w:pPr>
       <w:r>
         <w:rPr>
@@ -5124,6 +5791,14 @@
         <w:spacing w:after="0" w:afterAutospacing="0"/>
         <w:ind w:left="720" w:hanging="360"/>
         <w:jc w:val="both"/>
+        <w:rPr>
+          <w:rFonts w:ascii="Aptos" w:cs="Aptos" w:eastAsia="Aptos" w:hAnsi="Aptos"/>
+          <w:b w:val="0"/>
+          <w:bCs w:val="0"/>
+          <w:i w:val="0"/>
+          <w:iCs w:val="0"/>
+          <w:color w:val="000000"/>
+        </w:rPr>
       </w:pPr>
       <w:r>
         <w:rPr>
@@ -5141,6 +5816,14 @@
         <w:spacing w:after="0" w:afterAutospacing="0"/>
         <w:ind w:left="720" w:hanging="360"/>
         <w:jc w:val="both"/>
+        <w:rPr>
+          <w:rFonts w:ascii="Aptos" w:cs="Aptos" w:eastAsia="Aptos" w:hAnsi="Aptos"/>
+          <w:b w:val="0"/>
+          <w:bCs w:val="0"/>
+          <w:i w:val="0"/>
+          <w:iCs w:val="0"/>
+          <w:color w:val="000000"/>
+        </w:rPr>
       </w:pPr>
       <w:r>
         <w:rPr>
@@ -5157,6 +5840,14 @@
         </w:numPr>
         <w:ind w:left="720" w:hanging="360"/>
         <w:jc w:val="both"/>
+        <w:rPr>
+          <w:rFonts w:ascii="Aptos" w:cs="Aptos" w:eastAsia="Aptos" w:hAnsi="Aptos"/>
+          <w:b w:val="0"/>
+          <w:bCs w:val="0"/>
+          <w:i w:val="0"/>
+          <w:iCs w:val="0"/>
+          <w:color w:val="000000"/>
+        </w:rPr>
       </w:pPr>
       <w:r>
         <w:rPr>
@@ -5181,7 +5872,6 @@
         <w:rPr>
           <w:rtl w:val="0"/>
         </w:rPr>
-        <w:t xml:space="preserve"> permitir el registro de usuarios en la plataforma.</w:t>
       </w:r>
     </w:p>
     <w:p>
@@ -5193,6 +5883,14 @@
         <w:spacing w:after="0" w:afterAutospacing="0"/>
         <w:ind w:left="720" w:hanging="360"/>
         <w:jc w:val="both"/>
+        <w:rPr>
+          <w:rFonts w:ascii="Aptos" w:cs="Aptos" w:eastAsia="Aptos" w:hAnsi="Aptos"/>
+          <w:b w:val="0"/>
+          <w:bCs w:val="0"/>
+          <w:i w:val="0"/>
+          <w:iCs w:val="0"/>
+          <w:color w:val="000000"/>
+        </w:rPr>
       </w:pPr>
       <w:r>
         <w:rPr>
@@ -5210,6 +5908,14 @@
         <w:spacing w:after="0" w:afterAutospacing="0"/>
         <w:ind w:left="720" w:hanging="360"/>
         <w:jc w:val="both"/>
+        <w:rPr>
+          <w:rFonts w:ascii="Aptos" w:cs="Aptos" w:eastAsia="Aptos" w:hAnsi="Aptos"/>
+          <w:b w:val="0"/>
+          <w:bCs w:val="0"/>
+          <w:i w:val="0"/>
+          <w:iCs w:val="0"/>
+          <w:color w:val="000000"/>
+        </w:rPr>
       </w:pPr>
       <w:r>
         <w:rPr>
@@ -5226,6 +5932,14 @@
         </w:numPr>
         <w:ind w:left="720" w:hanging="360"/>
         <w:jc w:val="both"/>
+        <w:rPr>
+          <w:rFonts w:ascii="Aptos" w:cs="Aptos" w:eastAsia="Aptos" w:hAnsi="Aptos"/>
+          <w:b w:val="0"/>
+          <w:bCs w:val="0"/>
+          <w:i w:val="0"/>
+          <w:iCs w:val="0"/>
+          <w:color w:val="000000"/>
+        </w:rPr>
       </w:pPr>
       <w:r>
         <w:rPr>
@@ -5250,7 +5964,6 @@
         <w:rPr>
           <w:rtl w:val="0"/>
         </w:rPr>
-        <w:t xml:space="preserve"> realizar el envío de notificaciones a los locadores y locatarios, como recordatorios de pagos o para informar de un nuevo reclamo.</w:t>
       </w:r>
     </w:p>
     <w:p>
@@ -5262,6 +5975,14 @@
         <w:spacing w:after="0" w:afterAutospacing="0"/>
         <w:ind w:left="720" w:hanging="360"/>
         <w:jc w:val="both"/>
+        <w:rPr>
+          <w:rFonts w:ascii="Aptos" w:cs="Aptos" w:eastAsia="Aptos" w:hAnsi="Aptos"/>
+          <w:b w:val="0"/>
+          <w:bCs w:val="0"/>
+          <w:i w:val="0"/>
+          <w:iCs w:val="0"/>
+          <w:color w:val="000000"/>
+        </w:rPr>
       </w:pPr>
       <w:r>
         <w:rPr>
@@ -5278,6 +5999,14 @@
         </w:numPr>
         <w:ind w:left="720" w:hanging="360"/>
         <w:jc w:val="both"/>
+        <w:rPr>
+          <w:rFonts w:ascii="Aptos" w:cs="Aptos" w:eastAsia="Aptos" w:hAnsi="Aptos"/>
+          <w:b w:val="0"/>
+          <w:bCs w:val="0"/>
+          <w:i w:val="0"/>
+          <w:iCs w:val="0"/>
+          <w:color w:val="000000"/>
+        </w:rPr>
       </w:pPr>
       <w:r>
         <w:rPr>
@@ -5302,7 +6031,6 @@
         <w:rPr>
           <w:rtl w:val="0"/>
         </w:rPr>
-        <w:t xml:space="preserve"> permitir la comunicación dentro de la plataforma entre locador y locatario.</w:t>
       </w:r>
     </w:p>
     <w:p>
@@ -5314,6 +6042,14 @@
         <w:spacing w:after="0" w:afterAutospacing="0"/>
         <w:ind w:left="720" w:hanging="360"/>
         <w:jc w:val="both"/>
+        <w:rPr>
+          <w:rFonts w:ascii="Aptos" w:cs="Aptos" w:eastAsia="Aptos" w:hAnsi="Aptos"/>
+          <w:b w:val="0"/>
+          <w:bCs w:val="0"/>
+          <w:i w:val="0"/>
+          <w:iCs w:val="0"/>
+          <w:color w:val="000000"/>
+        </w:rPr>
       </w:pPr>
       <w:r>
         <w:rPr>
@@ -5331,6 +6067,14 @@
         <w:spacing w:after="0" w:afterAutospacing="0"/>
         <w:ind w:left="720" w:hanging="360"/>
         <w:jc w:val="both"/>
+        <w:rPr>
+          <w:rFonts w:ascii="Aptos" w:cs="Aptos" w:eastAsia="Aptos" w:hAnsi="Aptos"/>
+          <w:b w:val="0"/>
+          <w:bCs w:val="0"/>
+          <w:i w:val="0"/>
+          <w:iCs w:val="0"/>
+          <w:color w:val="000000"/>
+        </w:rPr>
       </w:pPr>
       <w:r>
         <w:rPr>
@@ -5347,6 +6091,14 @@
         </w:numPr>
         <w:ind w:left="720" w:hanging="360"/>
         <w:jc w:val="both"/>
+        <w:rPr>
+          <w:rFonts w:ascii="Aptos" w:cs="Aptos" w:eastAsia="Aptos" w:hAnsi="Aptos"/>
+          <w:b w:val="0"/>
+          <w:bCs w:val="0"/>
+          <w:i w:val="0"/>
+          <w:iCs w:val="0"/>
+          <w:color w:val="000000"/>
+        </w:rPr>
       </w:pPr>
       <w:r>
         <w:rPr>
@@ -5371,24 +6123,6 @@
         <w:rPr>
           <w:rtl w:val="0"/>
         </w:rPr>
-        <w:t xml:space="preserve"> recopilar los datos necesarios para la generación de reportes e informes.</w:t>
-      </w:r>
-    </w:p>
-    <w:p>
-      <w:pPr>
-        <w:numPr>
-          <w:ilvl w:val="0"/>
-          <w:numId w:val="6"/>
-        </w:numPr>
-        <w:spacing w:after="0" w:afterAutospacing="0"/>
-        <w:ind w:left="720" w:hanging="360"/>
-        <w:jc w:val="both"/>
-      </w:pPr>
-      <w:r>
-        <w:rPr>
-          <w:rtl w:val="0"/>
-        </w:rPr>
-        <w:t xml:space="preserve">Generar y emitir histograma de pagos realizados.</w:t>
       </w:r>
     </w:p>
     <w:p>
@@ -5399,196 +6133,20 @@
         </w:numPr>
         <w:ind w:left="720" w:hanging="360"/>
         <w:jc w:val="both"/>
-      </w:pPr>
-      <w:r>
-        <w:rPr>
-          <w:rtl w:val="0"/>
-        </w:rPr>
-        <w:t xml:space="preserve">Generar y emitir histograma de precio del alquiler.</w:t>
-      </w:r>
-    </w:p>
-    <w:p>
-      <w:pPr>
-        <w:jc w:val="both"/>
-        <w:rPr/>
-      </w:pPr>
-      <w:r>
-        <w:rPr>
-          <w:rtl w:val="0"/>
-        </w:rPr>
-      </w:r>
-    </w:p>
-    <w:p>
-      <w:pPr>
-        <w:jc w:val="both"/>
-        <w:rPr>
-          <w:b w:val="1"/>
-          <w:bCs w:val="1"/>
-          <w:u w:val="single"/>
-        </w:rPr>
-      </w:pPr>
-      <w:r>
-        <w:rPr>
-          <w:b w:val="1"/>
-          <w:bCs w:val="1"/>
-          <w:u w:val="single"/>
-          <w:rtl w:val="0"/>
-        </w:rPr>
-        <w:t xml:space="preserve">Requerimientos No Funcionales:</w:t>
-      </w:r>
-    </w:p>
-    <w:p>
-      <w:pPr>
-        <w:numPr>
-          <w:ilvl w:val="0"/>
-          <w:numId w:val="2"/>
-        </w:numPr>
-        <w:spacing w:after="0" w:afterAutospacing="0"/>
-        <w:ind w:left="720" w:hanging="360"/>
-        <w:jc w:val="both"/>
-      </w:pPr>
-      <w:r>
-        <w:rPr>
-          <w:rtl w:val="0"/>
-        </w:rPr>
-        <w:t xml:space="preserve">El proyecto se debe desarrollar con tecnologías web y soportar los navegadores Google Chrome, Mozilla Firefox y Safari, tanto en sus versiones de escritorio como móviles.</w:t>
-      </w:r>
-    </w:p>
-    <w:p>
-      <w:pPr>
-        <w:numPr>
-          <w:ilvl w:val="0"/>
-          <w:numId w:val="2"/>
-        </w:numPr>
-        <w:spacing w:after="0" w:afterAutospacing="0"/>
-        <w:ind w:left="720" w:hanging="360"/>
-        <w:jc w:val="both"/>
-      </w:pPr>
-      <w:r>
-        <w:rPr>
-          <w:rtl w:val="0"/>
-        </w:rPr>
-        <w:t xml:space="preserve">El diseño debe ser </w:t>
-      </w:r>
-      <w:r>
-        <w:rPr>
-          <w:i w:val="1"/>
-          <w:iCs w:val="1"/>
-          <w:rtl w:val="0"/>
-        </w:rPr>
-        <w:t xml:space="preserve">responsive</w:t>
-      </w:r>
-      <w:r>
-        <w:rPr>
-          <w:rtl w:val="0"/>
-        </w:rPr>
-        <w:t xml:space="preserve">.</w:t>
-      </w:r>
-    </w:p>
-    <w:p>
-      <w:pPr>
-        <w:numPr>
-          <w:ilvl w:val="0"/>
-          <w:numId w:val="2"/>
-        </w:numPr>
-        <w:spacing w:after="0" w:afterAutospacing="0"/>
-        <w:ind w:left="720" w:hanging="360"/>
-        <w:jc w:val="both"/>
-      </w:pPr>
-      <w:r>
-        <w:rPr>
-          <w:rtl w:val="0"/>
-        </w:rPr>
-        <w:t xml:space="preserve">La gestión de contratos debe seguir los lineamientos de la ley vigente de contratos de alquileres.</w:t>
-      </w:r>
-    </w:p>
-    <w:p>
-      <w:pPr>
-        <w:numPr>
-          <w:ilvl w:val="0"/>
-          <w:numId w:val="2"/>
-        </w:numPr>
-        <w:spacing w:after="0" w:afterAutospacing="0"/>
-        <w:ind w:left="720" w:hanging="360"/>
-        <w:jc w:val="both"/>
-      </w:pPr>
-      <w:r>
-        <w:rPr>
-          <w:rtl w:val="0"/>
-        </w:rPr>
-        <w:t xml:space="preserve">La actualización de precios de alquileres debe seguir los índices IPC o ICL proporcionados por la página oficial del gobierno.</w:t>
-      </w:r>
-    </w:p>
-    <w:p>
-      <w:pPr>
-        <w:numPr>
-          <w:ilvl w:val="0"/>
-          <w:numId w:val="2"/>
-        </w:numPr>
-        <w:spacing w:after="0" w:afterAutospacing="0"/>
-        <w:ind w:left="720" w:hanging="360"/>
-        <w:jc w:val="both"/>
-      </w:pPr>
-      <w:r>
-        <w:rPr>
-          <w:rtl w:val="0"/>
-        </w:rPr>
-        <w:t xml:space="preserve">Se deberá utilizar la base de datos Supabase.</w:t>
-      </w:r>
-    </w:p>
-    <w:p>
-      <w:pPr>
-        <w:numPr>
-          <w:ilvl w:val="0"/>
-          <w:numId w:val="2"/>
-        </w:numPr>
-        <w:spacing w:after="0" w:afterAutospacing="0"/>
-        <w:ind w:left="720" w:hanging="360"/>
-        <w:jc w:val="both"/>
-      </w:pPr>
-      <w:r>
-        <w:rPr>
-          <w:rtl w:val="0"/>
-        </w:rPr>
-        <w:t xml:space="preserve">La gestión de cobros debe poder realizarse en efectivo o a través de la plataforma de MercadoPago.</w:t>
-      </w:r>
-    </w:p>
-    <w:p>
-      <w:pPr>
-        <w:numPr>
-          <w:ilvl w:val="0"/>
-          <w:numId w:val="2"/>
-        </w:numPr>
-        <w:spacing w:after="0" w:afterAutospacing="0"/>
-        <w:ind w:left="720" w:hanging="360"/>
-        <w:jc w:val="both"/>
-      </w:pPr>
-      <w:r>
-        <w:rPr>
-          <w:rtl w:val="0"/>
-        </w:rPr>
-        <w:t xml:space="preserve">Se debe poder enviar notificaciones a los usuarios vía mail y dentro de la misma página web. </w:t>
-      </w:r>
-    </w:p>
-    <w:p>
-      <w:pPr>
-        <w:numPr>
-          <w:ilvl w:val="0"/>
-          <w:numId w:val="2"/>
-        </w:numPr>
-        <w:ind w:left="720" w:hanging="360"/>
-        <w:jc w:val="both"/>
-      </w:pPr>
-      <w:r>
-        <w:rPr>
-          <w:rtl w:val="0"/>
-        </w:rPr>
-        <w:t xml:space="preserve">Se utilizará una integración con IA (Gemini) para realizar análisis de los contratos y resolver consultas.</w:t>
-      </w:r>
-      <w:r>
-        <w:rPr>
-          <w:rtl w:val="0"/>
-        </w:rPr>
+        <w:rPr>
+          <w:rFonts w:ascii="Aptos" w:cs="Aptos" w:eastAsia="Aptos" w:hAnsi="Aptos"/>
+          <w:b w:val="0"/>
+          <w:bCs w:val="0"/>
+          <w:i w:val="0"/>
+          <w:iCs w:val="0"/>
+          <w:color w:val="000000"/>
+        </w:rPr>
+      </w:pPr>
+      <w:r>
+        <w:rPr>
+          <w:rtl w:val="0"/>
+        </w:rPr>
+        <w:t xml:space="preserve">Generar y emitir histograma de pagos realizados y del precio del alquiler.</w:t>
       </w:r>
     </w:p>
     <w:p>
@@ -5597,64 +6155,12 @@
         <w:ind w:hanging="566.9291338582675"/>
         <w:jc w:val="both"/>
         <w:rPr>
-          <w:color w:val="1c4587"/>
-        </w:rPr>
-      </w:pPr>
-      <w:bookmarkStart w:colFirst="0" w:colLast="0" w:name="_jacemy3d30wp" w:id="11"/>
-      <w:bookmarkEnd w:id="11"/>
-      <w:r>
-        <w:rPr>
-          <w:rtl w:val="0"/>
-        </w:rPr>
-        <w:t xml:space="preserve">6</w:t>
-      </w:r>
-      <w:r>
-        <w:rPr>
           <w:rFonts w:ascii="Arial" w:cs="Arial" w:eastAsia="Arial" w:hAnsi="Arial"/>
           <w:color w:val="1c4587"/>
-          <w:rtl w:val="0"/>
-        </w:rPr>
-        <w:t xml:space="preserve">- Objetivo del SI</w:t>
-      </w:r>
-      <w:r>
-        <w:rPr>
-          <w:rtl w:val="0"/>
-        </w:rPr>
-      </w:r>
-    </w:p>
-    <w:p>
-      <w:pPr>
-        <w:ind w:firstLine="425.19685039370086"/>
-        <w:jc w:val="both"/>
-        <w:rPr/>
-      </w:pPr>
-      <w:r>
-        <w:rPr>
-          <w:rtl w:val="0"/>
-        </w:rPr>
-        <w:t xml:space="preserve">El producto tiene como objetivo brindar información que permita centralizar el ofrecimiento, cierre de contrato y la gestión de alquileres realizados de manera directa entre locadores y locatarios. Busca simplificar la trazabilidad de los alquileres de inicio a fin, automatizar las actualizaciones periódicas del monto establecido en el contrato y la republicación de alquileres una vez vencido el plazo pactado, y agilizar el firmado de los contratos.</w:t>
-      </w:r>
-      <w:r>
-        <w:br w:type="page"/>
-      </w:r>
-      <w:r>
-        <w:rPr>
-          <w:rtl w:val="0"/>
-        </w:rPr>
-      </w:r>
-    </w:p>
-    <w:p>
-      <w:pPr>
-        <w:pStyle w:val="Heading1"/>
-        <w:ind w:hanging="566.9291338582675"/>
-        <w:jc w:val="both"/>
-        <w:rPr>
-          <w:rFonts w:ascii="Arial" w:cs="Arial" w:eastAsia="Arial" w:hAnsi="Arial"/>
-          <w:color w:val="1c4587"/>
-        </w:rPr>
-      </w:pPr>
-      <w:bookmarkStart w:colFirst="0" w:colLast="0" w:name="_ak8bsqwrcm1e" w:id="12"/>
-      <w:bookmarkEnd w:id="12"/>
+        </w:rPr>
+      </w:pPr>
+      <w:bookmarkStart w:colFirst="0" w:colLast="0" w:name="_ak8bsqwrcm1e" w:id="14"/>
+      <w:bookmarkEnd w:id="14"/>
       <w:r>
         <w:rPr>
           <w:rtl w:val="0"/>
@@ -5676,8 +6182,8 @@
         <w:ind w:firstLine="0"/>
         <w:rPr/>
       </w:pPr>
-      <w:bookmarkStart w:colFirst="0" w:colLast="0" w:name="_h0c8kcoi1k2d" w:id="13"/>
-      <w:bookmarkEnd w:id="13"/>
+      <w:bookmarkStart w:colFirst="0" w:colLast="0" w:name="_h0c8kcoi1k2d" w:id="15"/>
+      <w:bookmarkEnd w:id="15"/>
       <w:r>
         <w:rPr>
           <w:rtl w:val="0"/>
@@ -5744,8 +6250,8 @@
         <w:ind w:firstLine="0"/>
         <w:rPr/>
       </w:pPr>
-      <w:bookmarkStart w:colFirst="0" w:colLast="0" w:name="_q8r93pib59cc" w:id="14"/>
-      <w:bookmarkEnd w:id="14"/>
+      <w:bookmarkStart w:colFirst="0" w:colLast="0" w:name="_q8r93pib59cc" w:id="16"/>
+      <w:bookmarkEnd w:id="16"/>
       <w:r>
         <w:rPr>
           <w:rtl w:val="0"/>
@@ -5792,8 +6298,8 @@
         <w:ind w:firstLine="0"/>
         <w:rPr/>
       </w:pPr>
-      <w:bookmarkStart w:colFirst="0" w:colLast="0" w:name="_ocdh7ukl7t49" w:id="15"/>
-      <w:bookmarkEnd w:id="15"/>
+      <w:bookmarkStart w:colFirst="0" w:colLast="0" w:name="_ocdh7ukl7t49" w:id="17"/>
+      <w:bookmarkEnd w:id="17"/>
       <w:r>
         <w:rPr>
           <w:rtl w:val="0"/>
@@ -5843,8 +6349,8 @@
           <w:color w:val="1c4587"/>
         </w:rPr>
       </w:pPr>
-      <w:bookmarkStart w:colFirst="0" w:colLast="0" w:name="_z6tayr3fa25k" w:id="16"/>
-      <w:bookmarkEnd w:id="16"/>
+      <w:bookmarkStart w:colFirst="0" w:colLast="0" w:name="_z6tayr3fa25k" w:id="18"/>
+      <w:bookmarkEnd w:id="18"/>
       <w:r>
         <w:rPr>
           <w:rtl w:val="0"/>
@@ -5889,8 +6395,8 @@
         <w:jc w:val="both"/>
         <w:rPr/>
       </w:pPr>
-      <w:bookmarkStart w:colFirst="0" w:colLast="0" w:name="_hmeumocsepjs" w:id="17"/>
-      <w:bookmarkEnd w:id="17"/>
+      <w:bookmarkStart w:colFirst="0" w:colLast="0" w:name="_hmeumocsepjs" w:id="19"/>
+      <w:bookmarkEnd w:id="19"/>
       <w:r>
         <w:rPr>
           <w:rtl w:val="0"/>
@@ -5953,8 +6459,8 @@
         <w:jc w:val="both"/>
         <w:rPr/>
       </w:pPr>
-      <w:bookmarkStart w:colFirst="0" w:colLast="0" w:name="_45b7u0f8ggmm" w:id="18"/>
-      <w:bookmarkEnd w:id="18"/>
+      <w:bookmarkStart w:colFirst="0" w:colLast="0" w:name="_45b7u0f8ggmm" w:id="20"/>
+      <w:bookmarkEnd w:id="20"/>
       <w:r>
         <w:br w:type="page"/>
       </w:r>
@@ -5969,8 +6475,8 @@
         <w:pStyle w:val="Heading1"/>
         <w:rPr/>
       </w:pPr>
-      <w:bookmarkStart w:colFirst="0" w:colLast="0" w:name="_8bwyivuwpgge" w:id="19"/>
-      <w:bookmarkEnd w:id="19"/>
+      <w:bookmarkStart w:colFirst="0" w:colLast="0" w:name="_8bwyivuwpgge" w:id="21"/>
+      <w:bookmarkEnd w:id="21"/>
       <w:r>
         <w:rPr>
           <w:rtl w:val="0"/>
@@ -6466,8 +6972,8 @@
         <w:jc w:val="both"/>
         <w:rPr/>
       </w:pPr>
-      <w:bookmarkStart w:colFirst="0" w:colLast="0" w:name="_exq7y283i319" w:id="20"/>
-      <w:bookmarkEnd w:id="20"/>
+      <w:bookmarkStart w:colFirst="0" w:colLast="0" w:name="_exq7y283i319" w:id="22"/>
+      <w:bookmarkEnd w:id="22"/>
       <w:r>
         <w:br w:type="page"/>
       </w:r>
@@ -6484,8 +6990,8 @@
         <w:jc w:val="both"/>
         <w:rPr/>
       </w:pPr>
-      <w:bookmarkStart w:colFirst="0" w:colLast="0" w:name="_l4iquicyw92o" w:id="21"/>
-      <w:bookmarkEnd w:id="21"/>
+      <w:bookmarkStart w:colFirst="0" w:colLast="0" w:name="_l4iquicyw92o" w:id="23"/>
+      <w:bookmarkEnd w:id="23"/>
       <w:r>
         <w:rPr>
           <w:rtl w:val="0"/>
@@ -6512,8 +7018,8 @@
         <w:ind w:left="0" w:firstLine="0"/>
         <w:rPr/>
       </w:pPr>
-      <w:bookmarkStart w:colFirst="0" w:colLast="0" w:name="_klbz0frlpt9d" w:id="22"/>
-      <w:bookmarkEnd w:id="22"/>
+      <w:bookmarkStart w:colFirst="0" w:colLast="0" w:name="_klbz0frlpt9d" w:id="24"/>
+      <w:bookmarkEnd w:id="24"/>
       <w:r>
         <w:rPr>
           <w:rtl w:val="0"/>
@@ -6543,12 +7049,12 @@
           <wp:inline distB="114300" distT="114300" distL="114300" distR="114300">
             <wp:extent cx="2447925" cy="1867058"/>
             <wp:effectExtent b="0" l="0" r="0" t="0"/>
-            <wp:docPr id="10" name="image8.png"/>
+            <wp:docPr id="10" name="image3.png"/>
             <a:graphic>
               <a:graphicData uri="http://schemas.openxmlformats.org/drawingml/2006/picture">
                 <pic:pic>
                   <pic:nvPicPr>
-                    <pic:cNvPr id="0" name="image8.png"/>
+                    <pic:cNvPr id="0" name="image3.png"/>
                     <pic:cNvPicPr preferRelativeResize="0"/>
                   </pic:nvPicPr>
                   <pic:blipFill>
@@ -6583,12 +7089,12 @@
           <wp:inline distB="114300" distT="114300" distL="114300" distR="114300">
             <wp:extent cx="2314575" cy="1934482"/>
             <wp:effectExtent b="0" l="0" r="0" t="0"/>
-            <wp:docPr id="9" name="image1.png"/>
+            <wp:docPr id="9" name="image5.png"/>
             <a:graphic>
               <a:graphicData uri="http://schemas.openxmlformats.org/drawingml/2006/picture">
                 <pic:pic>
                   <pic:nvPicPr>
-                    <pic:cNvPr id="0" name="image1.png"/>
+                    <pic:cNvPr id="0" name="image5.png"/>
                     <pic:cNvPicPr preferRelativeResize="0"/>
                   </pic:nvPicPr>
                   <pic:blipFill>
@@ -6666,12 +7172,12 @@
           <wp:inline distB="114300" distT="114300" distL="114300" distR="114300">
             <wp:extent cx="4575038" cy="3080124"/>
             <wp:effectExtent b="0" l="0" r="0" t="0"/>
-            <wp:docPr id="4" name="image5.png"/>
+            <wp:docPr id="4" name="image8.png"/>
             <a:graphic>
               <a:graphicData uri="http://schemas.openxmlformats.org/drawingml/2006/picture">
                 <pic:pic>
                   <pic:nvPicPr>
-                    <pic:cNvPr id="0" name="image5.png"/>
+                    <pic:cNvPr id="0" name="image8.png"/>
                     <pic:cNvPicPr preferRelativeResize="0"/>
                   </pic:nvPicPr>
                   <pic:blipFill>
@@ -6752,12 +7258,12 @@
           <wp:inline distB="114300" distT="114300" distL="114300" distR="114300">
             <wp:extent cx="5039865" cy="3022600"/>
             <wp:effectExtent b="0" l="0" r="0" t="0"/>
-            <wp:docPr id="7" name="image9.png"/>
+            <wp:docPr id="7" name="image10.png"/>
             <a:graphic>
               <a:graphicData uri="http://schemas.openxmlformats.org/drawingml/2006/picture">
                 <pic:pic>
                   <pic:nvPicPr>
-                    <pic:cNvPr id="0" name="image9.png"/>
+                    <pic:cNvPr id="0" name="image10.png"/>
                     <pic:cNvPicPr preferRelativeResize="0"/>
                   </pic:nvPicPr>
                   <pic:blipFill>
@@ -6929,12 +7435,12 @@
           <wp:inline distB="114300" distT="114300" distL="114300" distR="114300">
             <wp:extent cx="3302937" cy="1942904"/>
             <wp:effectExtent b="0" l="0" r="0" t="0"/>
-            <wp:docPr id="13" name="image7.png"/>
+            <wp:docPr id="13" name="image2.png"/>
             <a:graphic>
               <a:graphicData uri="http://schemas.openxmlformats.org/drawingml/2006/picture">
                 <pic:pic>
                   <pic:nvPicPr>
-                    <pic:cNvPr id="0" name="image7.png"/>
+                    <pic:cNvPr id="0" name="image2.png"/>
                     <pic:cNvPicPr preferRelativeResize="0"/>
                   </pic:nvPicPr>
                   <pic:blipFill>
@@ -6967,12 +7473,12 @@
           <wp:inline distB="114300" distT="114300" distL="114300" distR="114300">
             <wp:extent cx="3927338" cy="2969631"/>
             <wp:effectExtent b="0" l="0" r="0" t="0"/>
-            <wp:docPr id="6" name="image4.png"/>
+            <wp:docPr id="6" name="image9.png"/>
             <a:graphic>
               <a:graphicData uri="http://schemas.openxmlformats.org/drawingml/2006/picture">
                 <pic:pic>
                   <pic:nvPicPr>
-                    <pic:cNvPr id="0" name="image4.png"/>
+                    <pic:cNvPr id="0" name="image9.png"/>
                     <pic:cNvPicPr preferRelativeResize="0"/>
                   </pic:nvPicPr>
                   <pic:blipFill>
@@ -7042,12 +7548,12 @@
           <wp:inline distB="114300" distT="114300" distL="114300" distR="114300">
             <wp:extent cx="5039865" cy="2311400"/>
             <wp:effectExtent b="0" l="0" r="0" t="0"/>
-            <wp:docPr id="8" name="image10.png"/>
+            <wp:docPr id="8" name="image11.png"/>
             <a:graphic>
               <a:graphicData uri="http://schemas.openxmlformats.org/drawingml/2006/picture">
                 <pic:pic>
                   <pic:nvPicPr>
-                    <pic:cNvPr id="0" name="image10.png"/>
+                    <pic:cNvPr id="0" name="image11.png"/>
                     <pic:cNvPicPr preferRelativeResize="0"/>
                   </pic:nvPicPr>
                   <pic:blipFill>
@@ -7544,12 +8050,12 @@
           <wp:extent cx="1733550" cy="638175"/>
           <wp:effectExtent b="0" l="0" r="0" t="0"/>
           <wp:wrapNone/>
-          <wp:docPr id="12" name="image11.png"/>
+          <wp:docPr id="12" name="image1.png"/>
           <a:graphic>
             <a:graphicData uri="http://schemas.openxmlformats.org/drawingml/2006/picture">
               <pic:pic>
                 <pic:nvPicPr>
-                  <pic:cNvPr id="0" name="image11.png"/>
+                  <pic:cNvPr id="0" name="image1.png"/>
                   <pic:cNvPicPr preferRelativeResize="0"/>
                 </pic:nvPicPr>
                 <pic:blipFill>

</xml_diff>

<commit_message>
docs: Aclarar creadores de scrum y fuente de información
También lo piden las pautas
</commit_message>
<xml_diff>
--- a/Documentación/doc - pdf/Estudio Inicial/Estudio Inicial - Proyecto Seminario Integrador - Gestión de alquileres.docx
+++ b/Documentación/doc - pdf/Estudio Inicial/Estudio Inicial - Proyecto Seminario Integrador - Gestión de alquileres.docx
@@ -1541,12 +1541,12 @@
             <wp:extent cx="1152525" cy="751840"/>
             <wp:effectExtent b="0" l="0" r="0" t="0"/>
             <wp:wrapNone/>
-            <wp:docPr descr="Resultado de imagen para logo utn" id="3" name="image4.png"/>
+            <wp:docPr descr="Resultado de imagen para logo utn" id="3" name="image8.png"/>
             <a:graphic>
               <a:graphicData uri="http://schemas.openxmlformats.org/drawingml/2006/picture">
                 <pic:pic>
                   <pic:nvPicPr>
-                    <pic:cNvPr descr="Resultado de imagen para logo utn" id="0" name="image4.png"/>
+                    <pic:cNvPr descr="Resultado de imagen para logo utn" id="0" name="image8.png"/>
                     <pic:cNvPicPr preferRelativeResize="0"/>
                   </pic:nvPicPr>
                   <pic:blipFill>
@@ -2548,7 +2548,7 @@
     </w:p>
     <w:sdt>
       <w:sdtPr>
-        <w:id w:val="682825160"/>
+        <w:id w:val="-2039869562"/>
         <w:docPartObj>
           <w:docPartGallery w:val="Table of Contents"/>
           <w:docPartUnique w:val="1"/>
@@ -4373,12 +4373,12 @@
           <wp:inline distB="114300" distT="114300" distL="114300" distR="114300">
             <wp:extent cx="5039865" cy="2501900"/>
             <wp:effectExtent b="0" l="0" r="0" t="0"/>
-            <wp:docPr id="5" name="image7.png"/>
+            <wp:docPr id="5" name="image1.png"/>
             <a:graphic>
               <a:graphicData uri="http://schemas.openxmlformats.org/drawingml/2006/picture">
                 <pic:pic>
                   <pic:nvPicPr>
-                    <pic:cNvPr id="0" name="image7.png"/>
+                    <pic:cNvPr id="0" name="image1.png"/>
                     <pic:cNvPicPr preferRelativeResize="0"/>
                   </pic:nvPicPr>
                   <pic:blipFill>
@@ -6389,6 +6389,66 @@
     </w:p>
     <w:p>
       <w:pPr>
+        <w:spacing w:after="200" w:before="240" w:line="276" w:lineRule="auto"/>
+        <w:ind w:firstLine="425.19685039370086"/>
+        <w:jc w:val="both"/>
+        <w:rPr/>
+      </w:pPr>
+      <w:r>
+        <w:rPr>
+          <w:rtl w:val="0"/>
+        </w:rPr>
+        <w:t xml:space="preserve">Scrum fue creado por Ken Schwaber y Jeff Sutherland. La información obtenida con respecto a esta metodología proviene tanto de los apuntes empleados a lo largo de diferentes materias en la universidad como de </w:t>
+      </w:r>
+      <w:r>
+        <w:rPr>
+          <w:rtl w:val="0"/>
+        </w:rPr>
+        <w:t xml:space="preserve">Scrum.org</w:t>
+      </w:r>
+      <w:r>
+        <w:rPr>
+          <w:rtl w:val="0"/>
+        </w:rPr>
+        <w:t xml:space="preserve"> (</w:t>
+      </w:r>
+      <w:hyperlink r:id="rId10">
+        <w:r>
+          <w:rPr>
+            <w:color w:val="1155cc"/>
+            <w:u w:val="single"/>
+            <w:rtl w:val="0"/>
+          </w:rPr>
+          <w:t xml:space="preserve">https://www.scrum.org/learning-series/what-is-scrum/</w:t>
+        </w:r>
+      </w:hyperlink>
+      <w:r>
+        <w:rPr>
+          <w:rtl w:val="0"/>
+        </w:rPr>
+        <w:t xml:space="preserve">). En cuanto a la filosofía ágil, los doce principios listados en el manifiesto ágil permiten un acercamiento a su funcionamiento</w:t>
+        <w:br w:type="textWrapping"/>
+        <w:t xml:space="preserve">(</w:t>
+      </w:r>
+      <w:hyperlink r:id="rId11">
+        <w:r>
+          <w:rPr>
+            <w:color w:val="1155cc"/>
+            <w:u w:val="single"/>
+            <w:rtl w:val="0"/>
+          </w:rPr>
+          <w:t xml:space="preserve">https://agilemanifesto.org/iso/es/principles.html</w:t>
+        </w:r>
+      </w:hyperlink>
+      <w:r>
+        <w:rPr>
+          <w:rtl w:val="0"/>
+        </w:rPr>
+        <w:t xml:space="preserve">).</w:t>
+      </w:r>
+    </w:p>
+    <w:p>
+      <w:pPr>
         <w:pStyle w:val="Heading1"/>
         <w:spacing w:after="200" w:before="240" w:line="276" w:lineRule="auto"/>
         <w:ind w:hanging="566.9291338582675"/>
@@ -6426,7 +6486,7 @@
                     <pic:cNvPicPr preferRelativeResize="0"/>
                   </pic:nvPicPr>
                   <pic:blipFill>
-                    <a:blip r:embed="rId10"/>
+                    <a:blip r:embed="rId12"/>
                     <a:srcRect b="0" l="5259" r="5553" t="7346"/>
                     <a:stretch>
                       <a:fillRect/>
@@ -7049,16 +7109,16 @@
           <wp:inline distB="114300" distT="114300" distL="114300" distR="114300">
             <wp:extent cx="2447925" cy="1867058"/>
             <wp:effectExtent b="0" l="0" r="0" t="0"/>
-            <wp:docPr id="10" name="image3.png"/>
+            <wp:docPr id="10" name="image10.png"/>
             <a:graphic>
               <a:graphicData uri="http://schemas.openxmlformats.org/drawingml/2006/picture">
                 <pic:pic>
                   <pic:nvPicPr>
-                    <pic:cNvPr id="0" name="image3.png"/>
+                    <pic:cNvPr id="0" name="image10.png"/>
                     <pic:cNvPicPr preferRelativeResize="0"/>
                   </pic:nvPicPr>
                   <pic:blipFill>
-                    <a:blip r:embed="rId11"/>
+                    <a:blip r:embed="rId13"/>
                     <a:srcRect b="0" l="0" r="0" t="0"/>
                     <a:stretch>
                       <a:fillRect/>
@@ -7089,16 +7149,16 @@
           <wp:inline distB="114300" distT="114300" distL="114300" distR="114300">
             <wp:extent cx="2314575" cy="1934482"/>
             <wp:effectExtent b="0" l="0" r="0" t="0"/>
-            <wp:docPr id="9" name="image5.png"/>
+            <wp:docPr id="9" name="image4.png"/>
             <a:graphic>
               <a:graphicData uri="http://schemas.openxmlformats.org/drawingml/2006/picture">
                 <pic:pic>
                   <pic:nvPicPr>
-                    <pic:cNvPr id="0" name="image5.png"/>
+                    <pic:cNvPr id="0" name="image4.png"/>
                     <pic:cNvPicPr preferRelativeResize="0"/>
                   </pic:nvPicPr>
                   <pic:blipFill>
-                    <a:blip r:embed="rId12"/>
+                    <a:blip r:embed="rId14"/>
                     <a:srcRect b="0" l="0" r="0" t="0"/>
                     <a:stretch>
                       <a:fillRect/>
@@ -7172,16 +7232,16 @@
           <wp:inline distB="114300" distT="114300" distL="114300" distR="114300">
             <wp:extent cx="4575038" cy="3080124"/>
             <wp:effectExtent b="0" l="0" r="0" t="0"/>
-            <wp:docPr id="4" name="image8.png"/>
+            <wp:docPr id="4" name="image9.png"/>
             <a:graphic>
               <a:graphicData uri="http://schemas.openxmlformats.org/drawingml/2006/picture">
                 <pic:pic>
                   <pic:nvPicPr>
-                    <pic:cNvPr id="0" name="image8.png"/>
+                    <pic:cNvPr id="0" name="image9.png"/>
                     <pic:cNvPicPr preferRelativeResize="0"/>
                   </pic:nvPicPr>
                   <pic:blipFill>
-                    <a:blip r:embed="rId13"/>
+                    <a:blip r:embed="rId15"/>
                     <a:srcRect b="0" l="0" r="0" t="0"/>
                     <a:stretch>
                       <a:fillRect/>
@@ -7258,16 +7318,16 @@
           <wp:inline distB="114300" distT="114300" distL="114300" distR="114300">
             <wp:extent cx="5039865" cy="3022600"/>
             <wp:effectExtent b="0" l="0" r="0" t="0"/>
-            <wp:docPr id="7" name="image10.png"/>
+            <wp:docPr id="7" name="image5.png"/>
             <a:graphic>
               <a:graphicData uri="http://schemas.openxmlformats.org/drawingml/2006/picture">
                 <pic:pic>
                   <pic:nvPicPr>
-                    <pic:cNvPr id="0" name="image10.png"/>
+                    <pic:cNvPr id="0" name="image5.png"/>
                     <pic:cNvPicPr preferRelativeResize="0"/>
                   </pic:nvPicPr>
                   <pic:blipFill>
-                    <a:blip r:embed="rId14"/>
+                    <a:blip r:embed="rId16"/>
                     <a:srcRect b="0" l="0" r="0" t="0"/>
                     <a:stretch>
                       <a:fillRect/>
@@ -7342,7 +7402,7 @@
                     <pic:cNvPicPr preferRelativeResize="0"/>
                   </pic:nvPicPr>
                   <pic:blipFill>
-                    <a:blip r:embed="rId15"/>
+                    <a:blip r:embed="rId17"/>
                     <a:srcRect b="0" l="0" r="0" t="0"/>
                     <a:stretch>
                       <a:fillRect/>
@@ -7385,7 +7445,7 @@
         </w:rPr>
         <w:t xml:space="preserve">Fig.5 Página de funciones de </w:t>
       </w:r>
-      <w:hyperlink r:id="rId16">
+      <w:hyperlink r:id="rId18">
         <w:r>
           <w:rPr>
             <w:rFonts w:ascii="Arial" w:cs="Arial" w:eastAsia="Arial" w:hAnsi="Arial"/>
@@ -7435,16 +7495,16 @@
           <wp:inline distB="114300" distT="114300" distL="114300" distR="114300">
             <wp:extent cx="3302937" cy="1942904"/>
             <wp:effectExtent b="0" l="0" r="0" t="0"/>
-            <wp:docPr id="13" name="image2.png"/>
+            <wp:docPr id="13" name="image3.png"/>
             <a:graphic>
               <a:graphicData uri="http://schemas.openxmlformats.org/drawingml/2006/picture">
                 <pic:pic>
                   <pic:nvPicPr>
-                    <pic:cNvPr id="0" name="image2.png"/>
+                    <pic:cNvPr id="0" name="image3.png"/>
                     <pic:cNvPicPr preferRelativeResize="0"/>
                   </pic:nvPicPr>
                   <pic:blipFill>
-                    <a:blip r:embed="rId17"/>
+                    <a:blip r:embed="rId19"/>
                     <a:srcRect b="0" l="0" r="0" t="0"/>
                     <a:stretch>
                       <a:fillRect/>
@@ -7473,16 +7533,16 @@
           <wp:inline distB="114300" distT="114300" distL="114300" distR="114300">
             <wp:extent cx="3927338" cy="2969631"/>
             <wp:effectExtent b="0" l="0" r="0" t="0"/>
-            <wp:docPr id="6" name="image9.png"/>
+            <wp:docPr id="6" name="image11.png"/>
             <a:graphic>
               <a:graphicData uri="http://schemas.openxmlformats.org/drawingml/2006/picture">
                 <pic:pic>
                   <pic:nvPicPr>
-                    <pic:cNvPr id="0" name="image9.png"/>
+                    <pic:cNvPr id="0" name="image11.png"/>
                     <pic:cNvPicPr preferRelativeResize="0"/>
                   </pic:nvPicPr>
                   <pic:blipFill>
-                    <a:blip r:embed="rId18"/>
+                    <a:blip r:embed="rId20"/>
                     <a:srcRect b="0" l="0" r="0" t="0"/>
                     <a:stretch>
                       <a:fillRect/>
@@ -7548,16 +7608,16 @@
           <wp:inline distB="114300" distT="114300" distL="114300" distR="114300">
             <wp:extent cx="5039865" cy="2311400"/>
             <wp:effectExtent b="0" l="0" r="0" t="0"/>
-            <wp:docPr id="8" name="image11.png"/>
+            <wp:docPr id="8" name="image2.png"/>
             <a:graphic>
               <a:graphicData uri="http://schemas.openxmlformats.org/drawingml/2006/picture">
                 <pic:pic>
                   <pic:nvPicPr>
-                    <pic:cNvPr id="0" name="image11.png"/>
+                    <pic:cNvPr id="0" name="image2.png"/>
                     <pic:cNvPicPr preferRelativeResize="0"/>
                   </pic:nvPicPr>
                   <pic:blipFill>
-                    <a:blip r:embed="rId19"/>
+                    <a:blip r:embed="rId21"/>
                     <a:srcRect b="0" l="0" r="0" t="0"/>
                     <a:stretch>
                       <a:fillRect/>
@@ -7604,9 +7664,9 @@
       </w:r>
     </w:p>
     <w:sectPr>
-      <w:headerReference r:id="rId20" w:type="default"/>
-      <w:footerReference r:id="rId21" w:type="default"/>
-      <w:footerReference r:id="rId22" w:type="first"/>
+      <w:headerReference r:id="rId22" w:type="default"/>
+      <w:footerReference r:id="rId23" w:type="default"/>
+      <w:footerReference r:id="rId24" w:type="first"/>
       <w:pgSz w:h="16838" w:w="11906" w:orient="portrait"/>
       <w:pgMar w:bottom="1417" w:top="1842.51968503937" w:left="2267.716535433071" w:right="1701" w:header="708" w:footer="708"/>
       <w:pgNumType w:start="1"/>
@@ -8050,12 +8110,12 @@
           <wp:extent cx="1733550" cy="638175"/>
           <wp:effectExtent b="0" l="0" r="0" t="0"/>
           <wp:wrapNone/>
-          <wp:docPr id="12" name="image1.png"/>
+          <wp:docPr id="12" name="image7.png"/>
           <a:graphic>
             <a:graphicData uri="http://schemas.openxmlformats.org/drawingml/2006/picture">
               <pic:pic>
                 <pic:nvPicPr>
-                  <pic:cNvPr id="0" name="image1.png"/>
+                  <pic:cNvPr id="0" name="image7.png"/>
                   <pic:cNvPicPr preferRelativeResize="0"/>
                 </pic:nvPicPr>
                 <pic:blipFill>

</xml_diff>

<commit_message>
docs: Modificar prefactibilidad para orientarla más al usuario
</commit_message>
<xml_diff>
--- a/Documentación/doc - pdf/Estudio Inicial/Estudio Inicial - Proyecto Seminario Integrador - Gestión de alquileres.docx
+++ b/Documentación/doc - pdf/Estudio Inicial/Estudio Inicial - Proyecto Seminario Integrador - Gestión de alquileres.docx
@@ -1541,12 +1541,12 @@
             <wp:extent cx="1152525" cy="751840"/>
             <wp:effectExtent b="0" l="0" r="0" t="0"/>
             <wp:wrapNone/>
-            <wp:docPr descr="Resultado de imagen para logo utn" id="3" name="image8.png"/>
+            <wp:docPr descr="Resultado de imagen para logo utn" id="3" name="image3.png"/>
             <a:graphic>
               <a:graphicData uri="http://schemas.openxmlformats.org/drawingml/2006/picture">
                 <pic:pic>
                   <pic:nvPicPr>
-                    <pic:cNvPr descr="Resultado de imagen para logo utn" id="0" name="image8.png"/>
+                    <pic:cNvPr descr="Resultado de imagen para logo utn" id="0" name="image3.png"/>
                     <pic:cNvPicPr preferRelativeResize="0"/>
                   </pic:nvPicPr>
                   <pic:blipFill>
@@ -2548,7 +2548,7 @@
     </w:p>
     <w:sdt>
       <w:sdtPr>
-        <w:id w:val="-2039869562"/>
+        <w:id w:val="1018761809"/>
         <w:docPartObj>
           <w:docPartGallery w:val="Table of Contents"/>
           <w:docPartUnique w:val="1"/>
@@ -4373,12 +4373,12 @@
           <wp:inline distB="114300" distT="114300" distL="114300" distR="114300">
             <wp:extent cx="5039865" cy="2501900"/>
             <wp:effectExtent b="0" l="0" r="0" t="0"/>
-            <wp:docPr id="5" name="image1.png"/>
+            <wp:docPr id="5" name="image2.png"/>
             <a:graphic>
               <a:graphicData uri="http://schemas.openxmlformats.org/drawingml/2006/picture">
                 <pic:pic>
                   <pic:nvPicPr>
-                    <pic:cNvPr id="0" name="image1.png"/>
+                    <pic:cNvPr id="0" name="image2.png"/>
                     <pic:cNvPicPr preferRelativeResize="0"/>
                   </pic:nvPicPr>
                   <pic:blipFill>
@@ -6179,7 +6179,6 @@
     <w:p>
       <w:pPr>
         <w:pStyle w:val="Heading2"/>
-        <w:ind w:firstLine="0"/>
         <w:rPr/>
       </w:pPr>
       <w:bookmarkStart w:colFirst="0" w:colLast="0" w:name="_h0c8kcoi1k2d" w:id="15"/>
@@ -6188,13 +6187,7 @@
         <w:rPr>
           <w:rtl w:val="0"/>
         </w:rPr>
-        <w:t xml:space="preserve">7</w:t>
-      </w:r>
-      <w:r>
-        <w:rPr>
-          <w:rtl w:val="0"/>
-        </w:rPr>
-        <w:t xml:space="preserve">.1- Prefactibilidad técnica</w:t>
+        <w:t xml:space="preserve">7.1- Prefactibilidad técnica</w:t>
       </w:r>
     </w:p>
     <w:p>
@@ -6208,7 +6201,61 @@
         <w:rPr>
           <w:rtl w:val="0"/>
         </w:rPr>
-        <w:t xml:space="preserve">El desarrollo se apoya en un stack tecnológico moderno y ampliamente documentado: Next.js y Node.js para la aplicación web, Supabase como base de datos y backend (autenticación, almacenamiento), y Vercel como plataforma de despliegue </w:t>
+        <w:t xml:space="preserve">Para conectarse y utilizar la plataforma, los usuarios necesitarán disponer de conexión a internet y un navegador web en un dispositivo inteligente, como ser: una tablet, un teléfono móvil o una computadora.</w:t>
+      </w:r>
+    </w:p>
+    <w:p>
+      <w:pPr>
+        <w:spacing w:after="200" w:line="276" w:lineRule="auto"/>
+        <w:ind w:firstLine="425.19685039370086"/>
+        <w:jc w:val="both"/>
+        <w:rPr/>
+      </w:pPr>
+      <w:r>
+        <w:rPr>
+          <w:rtl w:val="0"/>
+        </w:rPr>
+        <w:t xml:space="preserve">En cuanto al desarrollo, no se precisa de ninguna innovación tecnológica, sino que se hará uso de tecnologías existentes.</w:t>
+      </w:r>
+    </w:p>
+    <w:p>
+      <w:pPr>
+        <w:pStyle w:val="Heading2"/>
+        <w:rPr/>
+      </w:pPr>
+      <w:bookmarkStart w:colFirst="0" w:colLast="0" w:name="_q8r93pib59cc" w:id="16"/>
+      <w:bookmarkEnd w:id="16"/>
+      <w:r>
+        <w:rPr>
+          <w:rtl w:val="0"/>
+        </w:rPr>
+        <w:t xml:space="preserve">7.2- Prefactibilidad económica</w:t>
+      </w:r>
+    </w:p>
+    <w:p>
+      <w:pPr>
+        <w:ind w:firstLine="425.19685039370086"/>
+        <w:rPr/>
+      </w:pPr>
+      <w:r>
+        <w:rPr>
+          <w:rtl w:val="0"/>
+        </w:rPr>
+        <w:t xml:space="preserve">El costo de uso de la web será nulo para quienes busquen propiedades a alquilar y se cobrará una pequeña comisión mensual a los propietarios que reciban el pago de alquiler mediante MercadoPago. Además, a fines de sostener el alojamiento de la web en un servidor, se mostrarán pequeños anuncios en los bordes de la misma.</w:t>
+      </w:r>
+    </w:p>
+    <w:p>
+      <w:pPr>
+        <w:spacing w:after="200" w:line="276" w:lineRule="auto"/>
+        <w:ind w:firstLine="425.19685039370086"/>
+        <w:jc w:val="both"/>
+        <w:rPr/>
+      </w:pPr>
+      <w:r>
+        <w:rPr>
+          <w:rtl w:val="0"/>
+        </w:rPr>
+        <w:t xml:space="preserve">La arquitectura </w:t>
       </w:r>
       <w:r>
         <w:rPr>
@@ -6222,80 +6269,12 @@
         <w:rPr>
           <w:rtl w:val="0"/>
         </w:rPr>
-        <w:t xml:space="preserve">. Los organismos oficiales (INDEC y BCRA) publican sus índices de forma pública, lo que permite automatizar la actualización de los valores de ajuste. La integración de cobros puede resolverse con una pasarela de pago existente (por ejemplo, MercadoPago), evitando desarrollar infraestructura de procesamiento de pagos propia.</w:t>
-      </w:r>
-    </w:p>
-    <w:p>
-      <w:pPr>
-        <w:spacing w:after="200" w:line="276" w:lineRule="auto"/>
-        <w:ind w:firstLine="425.19685039370086"/>
-        <w:jc w:val="both"/>
-        <w:rPr/>
-      </w:pPr>
-      <w:r>
-        <w:rPr>
-          <w:rtl w:val="0"/>
-        </w:rPr>
-        <w:t xml:space="preserve">En cuanto a los usuarios, para conectarse y utilizar la plataforma necesitarán disponer de conexión a internet y un navegador web en un dispositivo inteligente, como ser: una tablet, un teléfono móvil o una computadora.</w:t>
-      </w:r>
-      <w:r>
-        <w:rPr>
-          <w:rtl w:val="0"/>
-        </w:rPr>
+        <w:t xml:space="preserve"> propuesta (Vercel y Supabase) permite operar el MVP dentro de los niveles gratuitos o de bajo costo de estos servicios mientras el volumen de usuarios es reducido, lo que mantiene acotada la inversión en infraestructura durante el desarrollo académico del proyecto. La pasarela de pago no requiere costo fijo, sino una comisión por transacción procesada. El principal costo del proyecto es el esfuerzo de desarrollo, cubierto por el equipo del Seminario Integrador. Para una eventual puesta en producción comercial, el modelo de ingresos podría basarse en una comisión sobre el cobro gestionado o en una suscripción mensual, aunque ese análisis de negocio excede el alcance académico del presente informe.</w:t>
       </w:r>
     </w:p>
     <w:p>
       <w:pPr>
         <w:pStyle w:val="Heading2"/>
-        <w:ind w:firstLine="0"/>
-        <w:rPr/>
-      </w:pPr>
-      <w:bookmarkStart w:colFirst="0" w:colLast="0" w:name="_q8r93pib59cc" w:id="16"/>
-      <w:bookmarkEnd w:id="16"/>
-      <w:r>
-        <w:rPr>
-          <w:rtl w:val="0"/>
-        </w:rPr>
-        <w:t xml:space="preserve">7.2- Prefactibilidad económica</w:t>
-      </w:r>
-    </w:p>
-    <w:p>
-      <w:pPr>
-        <w:spacing w:after="200" w:line="276" w:lineRule="auto"/>
-        <w:ind w:firstLine="425.19685039370086"/>
-        <w:jc w:val="both"/>
-        <w:rPr/>
-      </w:pPr>
-      <w:r>
-        <w:rPr>
-          <w:rtl w:val="0"/>
-        </w:rPr>
-        <w:t xml:space="preserve">La arquitectura </w:t>
-      </w:r>
-      <w:r>
-        <w:rPr>
-          <w:i w:val="1"/>
-          <w:iCs w:val="1"/>
-          <w:rtl w:val="0"/>
-        </w:rPr>
-        <w:t xml:space="preserve">serverless</w:t>
-      </w:r>
-      <w:r>
-        <w:rPr>
-          <w:rtl w:val="0"/>
-        </w:rPr>
-        <w:t xml:space="preserve"> propuesta (Vercel y Supabase) permite operar el MVP dentro de los niveles gratuitos o de bajo costo de estos servicios mientras el volumen de usuarios es reducido, lo que mantiene acotada la inversión en infraestructura durante el desarrollo académico del proyecto. La pasarela de pago no requiere costo fijo, sino una comisión por transacción procesada. El principal costo del proyecto es el esfuerzo de desarrollo, cubierto por el equipo del Seminario Integrador. Para una eventual puesta en producción comercial, el modelo de ingresos podría basarse en una comisión sobre el cobro gestionado o en una suscripción mensual, aunque ese análisis de negocio excede el alcance académico del presente informe.</w:t>
-      </w:r>
-      <w:r>
-        <w:rPr>
-          <w:rtl w:val="0"/>
-        </w:rPr>
-      </w:r>
-    </w:p>
-    <w:p>
-      <w:pPr>
-        <w:pStyle w:val="Heading2"/>
-        <w:ind w:firstLine="0"/>
         <w:rPr/>
       </w:pPr>
       <w:bookmarkStart w:colFirst="0" w:colLast="0" w:name="_ocdh7ukl7t49" w:id="17"/>
@@ -6304,7 +6283,19 @@
         <w:rPr>
           <w:rtl w:val="0"/>
         </w:rPr>
-        <w:t xml:space="preserve">7.3- Prefactibilidad operativa</w:t>
+        <w:t xml:space="preserve">7.3- </w:t>
+      </w:r>
+      <w:r>
+        <w:rPr>
+          <w:rtl w:val="0"/>
+        </w:rPr>
+        <w:t xml:space="preserve">Prefactibilidad</w:t>
+      </w:r>
+      <w:r>
+        <w:rPr>
+          <w:rtl w:val="0"/>
+        </w:rPr>
+        <w:t xml:space="preserve"> operativa</w:t>
       </w:r>
     </w:p>
     <w:p>
@@ -6515,15 +6506,10 @@
     <w:p>
       <w:pPr>
         <w:pStyle w:val="Heading1"/>
-        <w:ind w:hanging="566.9291338582675"/>
-        <w:jc w:val="both"/>
         <w:rPr/>
       </w:pPr>
-      <w:bookmarkStart w:colFirst="0" w:colLast="0" w:name="_45b7u0f8ggmm" w:id="20"/>
+      <w:bookmarkStart w:colFirst="0" w:colLast="0" w:name="_yh563rrqt3gk" w:id="20"/>
       <w:bookmarkEnd w:id="20"/>
-      <w:r>
-        <w:br w:type="page"/>
-      </w:r>
       <w:r>
         <w:rPr>
           <w:rtl w:val="0"/>
@@ -7109,12 +7095,12 @@
           <wp:inline distB="114300" distT="114300" distL="114300" distR="114300">
             <wp:extent cx="2447925" cy="1867058"/>
             <wp:effectExtent b="0" l="0" r="0" t="0"/>
-            <wp:docPr id="10" name="image10.png"/>
+            <wp:docPr id="10" name="image8.png"/>
             <a:graphic>
               <a:graphicData uri="http://schemas.openxmlformats.org/drawingml/2006/picture">
                 <pic:pic>
                   <pic:nvPicPr>
-                    <pic:cNvPr id="0" name="image10.png"/>
+                    <pic:cNvPr id="0" name="image8.png"/>
                     <pic:cNvPicPr preferRelativeResize="0"/>
                   </pic:nvPicPr>
                   <pic:blipFill>
@@ -7149,12 +7135,12 @@
           <wp:inline distB="114300" distT="114300" distL="114300" distR="114300">
             <wp:extent cx="2314575" cy="1934482"/>
             <wp:effectExtent b="0" l="0" r="0" t="0"/>
-            <wp:docPr id="9" name="image4.png"/>
+            <wp:docPr id="9" name="image1.png"/>
             <a:graphic>
               <a:graphicData uri="http://schemas.openxmlformats.org/drawingml/2006/picture">
                 <pic:pic>
                   <pic:nvPicPr>
-                    <pic:cNvPr id="0" name="image4.png"/>
+                    <pic:cNvPr id="0" name="image1.png"/>
                     <pic:cNvPicPr preferRelativeResize="0"/>
                   </pic:nvPicPr>
                   <pic:blipFill>
@@ -7232,12 +7218,12 @@
           <wp:inline distB="114300" distT="114300" distL="114300" distR="114300">
             <wp:extent cx="4575038" cy="3080124"/>
             <wp:effectExtent b="0" l="0" r="0" t="0"/>
-            <wp:docPr id="4" name="image9.png"/>
+            <wp:docPr id="4" name="image10.png"/>
             <a:graphic>
               <a:graphicData uri="http://schemas.openxmlformats.org/drawingml/2006/picture">
                 <pic:pic>
                   <pic:nvPicPr>
-                    <pic:cNvPr id="0" name="image9.png"/>
+                    <pic:cNvPr id="0" name="image10.png"/>
                     <pic:cNvPicPr preferRelativeResize="0"/>
                   </pic:nvPicPr>
                   <pic:blipFill>
@@ -7318,12 +7304,12 @@
           <wp:inline distB="114300" distT="114300" distL="114300" distR="114300">
             <wp:extent cx="5039865" cy="3022600"/>
             <wp:effectExtent b="0" l="0" r="0" t="0"/>
-            <wp:docPr id="7" name="image5.png"/>
+            <wp:docPr id="7" name="image6.png"/>
             <a:graphic>
               <a:graphicData uri="http://schemas.openxmlformats.org/drawingml/2006/picture">
                 <pic:pic>
                   <pic:nvPicPr>
-                    <pic:cNvPr id="0" name="image5.png"/>
+                    <pic:cNvPr id="0" name="image6.png"/>
                     <pic:cNvPicPr preferRelativeResize="0"/>
                   </pic:nvPicPr>
                   <pic:blipFill>
@@ -7393,12 +7379,12 @@
           <wp:inline distB="114300" distT="114300" distL="114300" distR="114300">
             <wp:extent cx="4260713" cy="4598992"/>
             <wp:effectExtent b="0" l="0" r="0" t="0"/>
-            <wp:docPr id="11" name="image6.png"/>
+            <wp:docPr id="11" name="image5.png"/>
             <a:graphic>
               <a:graphicData uri="http://schemas.openxmlformats.org/drawingml/2006/picture">
                 <pic:pic>
                   <pic:nvPicPr>
-                    <pic:cNvPr id="0" name="image6.png"/>
+                    <pic:cNvPr id="0" name="image5.png"/>
                     <pic:cNvPicPr preferRelativeResize="0"/>
                   </pic:nvPicPr>
                   <pic:blipFill>
@@ -7495,12 +7481,12 @@
           <wp:inline distB="114300" distT="114300" distL="114300" distR="114300">
             <wp:extent cx="3302937" cy="1942904"/>
             <wp:effectExtent b="0" l="0" r="0" t="0"/>
-            <wp:docPr id="13" name="image3.png"/>
+            <wp:docPr id="13" name="image11.png"/>
             <a:graphic>
               <a:graphicData uri="http://schemas.openxmlformats.org/drawingml/2006/picture">
                 <pic:pic>
                   <pic:nvPicPr>
-                    <pic:cNvPr id="0" name="image3.png"/>
+                    <pic:cNvPr id="0" name="image11.png"/>
                     <pic:cNvPicPr preferRelativeResize="0"/>
                   </pic:nvPicPr>
                   <pic:blipFill>
@@ -7533,12 +7519,12 @@
           <wp:inline distB="114300" distT="114300" distL="114300" distR="114300">
             <wp:extent cx="3927338" cy="2969631"/>
             <wp:effectExtent b="0" l="0" r="0" t="0"/>
-            <wp:docPr id="6" name="image11.png"/>
+            <wp:docPr id="6" name="image7.png"/>
             <a:graphic>
               <a:graphicData uri="http://schemas.openxmlformats.org/drawingml/2006/picture">
                 <pic:pic>
                   <pic:nvPicPr>
-                    <pic:cNvPr id="0" name="image11.png"/>
+                    <pic:cNvPr id="0" name="image7.png"/>
                     <pic:cNvPicPr preferRelativeResize="0"/>
                   </pic:nvPicPr>
                   <pic:blipFill>
@@ -7608,12 +7594,12 @@
           <wp:inline distB="114300" distT="114300" distL="114300" distR="114300">
             <wp:extent cx="5039865" cy="2311400"/>
             <wp:effectExtent b="0" l="0" r="0" t="0"/>
-            <wp:docPr id="8" name="image2.png"/>
+            <wp:docPr id="8" name="image4.png"/>
             <a:graphic>
               <a:graphicData uri="http://schemas.openxmlformats.org/drawingml/2006/picture">
                 <pic:pic>
                   <pic:nvPicPr>
-                    <pic:cNvPr id="0" name="image2.png"/>
+                    <pic:cNvPr id="0" name="image4.png"/>
                     <pic:cNvPicPr preferRelativeResize="0"/>
                   </pic:nvPicPr>
                   <pic:blipFill>
@@ -8110,12 +8096,12 @@
           <wp:extent cx="1733550" cy="638175"/>
           <wp:effectExtent b="0" l="0" r="0" t="0"/>
           <wp:wrapNone/>
-          <wp:docPr id="12" name="image7.png"/>
+          <wp:docPr id="12" name="image9.png"/>
           <a:graphic>
             <a:graphicData uri="http://schemas.openxmlformats.org/drawingml/2006/picture">
               <pic:pic>
                 <pic:nvPicPr>
-                  <pic:cNvPr id="0" name="image7.png"/>
+                  <pic:cNvPr id="0" name="image9.png"/>
                   <pic:cNvPicPr preferRelativeResize="0"/>
                 </pic:nvPicPr>
                 <pic:blipFill>

</xml_diff>